<commit_message>
Deploy preview for PR 561 🛫
</commit_message>
<xml_diff>
--- a/pr-preview/pr-561/UCD-SeRG-Lab-Manual-tracked-changes.docx
+++ b/pr-preview/pr-561/UCD-SeRG-Lab-Manual-tracked-changes.docx
@@ -28614,7 +28614,7 @@
       </w:ins>
       <w:ins w:id="986" w:author="PR Preview" w:date="2024-01-01T00:00:00Z">
         <w:r>
-          <w:t xml:space="preserve">3a6136a</w:t>
+          <w:t xml:space="preserve">4e29236</w:t>
         </w:r>
       </w:ins>
     </w:p>
@@ -28642,7 +28642,7 @@
       </w:ins>
       <w:ins w:id="987" w:author="PR Preview" w:date="2024-01-01T00:00:00Z">
         <w:r>
-          <w:t xml:space="preserve">3a6136a84157b4faf5f4174ece656864ebdd4146</w:t>
+          <w:t xml:space="preserve">4e292369a456bdb29918f7d07a2a72a59d355804</w:t>
         </w:r>
       </w:ins>
     </w:p>
@@ -28670,7 +28670,7 @@
       </w:ins>
       <w:ins w:id="988" w:author="PR Preview" w:date="2024-01-01T00:00:00Z">
         <w:r>
-          <w:t xml:space="preserve">2026-10-14 00:35:59 -0700</w:t>
+          <w:t xml:space="preserve">2026-10-14 07:55:53 +0000</w:t>
         </w:r>
       </w:ins>
     </w:p>

</xml_diff>